<commit_message>
fix: v2.4.2 — Mac xcode-select git shim, preflight hardening, error reframing
Mac first-launch fix: macHasXcodeCLT() now verifies actual git binary
exists (not just xcode-select -p path). When no CLT/Homebrew git found,
creates curl-based git shim that downloads GitHub tarballs — fixes
baileys/libsignal-node.git dependency that requires real git clone.

Preflight review fixes: corrupt config returns pass:false + audit log,
better-sqlite3 auto-fix logs errors, model-downloader isPackaged guard,
warnings now audit-logged.

Error reframing: splash diagnostic checklist (xcode-select detection),
wizard Vietnamese messages, dashboard Google invalid_grant.

Hardening: gateway Zalo watchdog recovery, image-gen content policy
detection, fb-publisher token expiry enrichment, cron group delivery,
fb-schedule callback wiring.

Co-Authored-By: Claude Opus 4.6 <noreply@anthropic.com>
</commit_message>
<xml_diff>
--- a/docs/9BizClaw-Technical-Overview.docx
+++ b/docs/9BizClaw-Technical-Overview.docx
@@ -67,7 +67,7 @@
           <w:sz w:val="20"/>
           <w:szCs w:val="20"/>
         </w:rPr>
-        <w:t xml:space="preserve">Version 2.4.0  |  Cập nhật: 2026-04-28</w:t>
+        <w:t xml:space="preserve">Version 2.4.0  |  Cập nhật: 2026-05-09</w:t>
       </w:r>
     </w:p>
     <w:p>
@@ -82,7 +82,7 @@
           <w:sz w:val="20"/>
           <w:szCs w:val="20"/>
         </w:rPr>
-        <w:t xml:space="preserve">MODORO Tech Corp  |  Nội bộ — Không phát hành công khai</w:t>
+        <w:t xml:space="preserve">9Biz  |  Nội bộ — Không phát hành công khai</w:t>
       </w:r>
     </w:p>
     <w:p>
@@ -6970,7 +6970,7 @@
           <w:sz w:val="21"/>
           <w:szCs w:val="21"/>
         </w:rPr>
-        <w:t xml:space="preserve">/api/cron/create, /list, /delete, /toggle</w:t>
+        <w:t xml:space="preserve">/api/cron/create, /replace, /list, /delete, /toggle</w:t>
       </w:r>
     </w:p>
     <w:p>
@@ -8926,7 +8926,7 @@
           <w:sz w:val="21"/>
           <w:szCs w:val="21"/>
         </w:rPr>
-        <w:t xml:space="preserve">DMG ship vendor/ directory trực tiếp (APFS drag-drop nhanh). Developer ID: MODORO Tech Corp, Team ID: UQKLW82B3A. Apple Notarized.</w:t>
+        <w:t xml:space="preserve">DMG ship vendor/ directory trực tiếp (APFS drag-drop nhanh). Developer ID: 9Biz, Team ID: UQKLW82B3A. Apple Notarized.</w:t>
       </w:r>
     </w:p>
     <w:p>

</xml_diff>